<commit_message>
Add CKAD, publish the 623 line, and state 12 years in cybersecurity.
Regenerate the resume DOCX and PDF from content/resume-download.json with
the in-repo download builder so the binaries match the updated source.

Co-authored-by: Stephen M Abbott <stevologic@users.noreply.github.com>
</commit_message>
<xml_diff>
--- a/public/resume-files/Stephen-Abbott-Resume.docx
+++ b/public/resume-files/Stephen-Abbott-Resume.docx
@@ -26,7 +26,7 @@
         <w:rPr>
           <w:sz w:val="19"/>
         </w:rPr>
-        <w:t>Phoenix, Arizona | +1 (775) 599-7046 | stevo@stevo.ai</w:t>
+        <w:t>Phoenix, Arizona | +1 (623) 363-4985 | stevo@stevo.ai</w:t>
       </w:r>
     </w:p>
     <w:p>
@@ -331,7 +331,7 @@
     <w:p>
       <w:pPr/>
       <w:r>
-        <w:t>OSCP; AWS Certified Cloud Practitioner. CRISC bootcamp training; SpecterOps Adversary Tactics. Harvard Leadership Training; Duke University Accelerate Your Growth leadership training.</w:t>
+        <w:t>OSCP; CKAD; AWS Certified Cloud Practitioner. CRISC bootcamp training; SpecterOps Adversary Tactics. Harvard Leadership Training; Duke University Accelerate Your Growth leadership training.</w:t>
       </w:r>
     </w:p>
     <w:sectPr>

</xml_diff>